<commit_message>
v1.3.11: Self-service trials and purchases
</commit_message>
<xml_diff>
--- a/static/content/files/Blueprint System Security Plan Template.docx
+++ b/static/content/files/Blueprint System Security Plan Template.docx
@@ -14304,16 +14304,16 @@
         <w:t xml:space="preserve"> </w:t>
       </w:r>
       <w:r>
-        <w:t xml:space="preserve">System Security at Plan</w:t>
-      </w:r>
-      <w:r>
-        <w:t xml:space="preserve"> </w:t>
-      </w:r>
-      <w:r>
-        <w:rPr>
-          <w:rStyle w:val="VerbatimChar"/>
-        </w:rPr>
-        <w:t xml:space="preserve">&lt;insert document reference here&gt;</w:t>
+        <w:t xml:space="preserve">System Security Plan at</w:t>
+      </w:r>
+      <w:r>
+        <w:t xml:space="preserve"> </w:t>
+      </w:r>
+      <w:r>
+        <w:rPr>
+          <w:rStyle w:val="VerbatimChar"/>
+        </w:rPr>
+        <w:t xml:space="preserve">&lt;INSERT DOCUMENT REFERENCE HERE&gt;</w:t>
       </w:r>
       <w:r>
         <w:t xml:space="preserve"> </w:t>
@@ -14370,7 +14370,7 @@
           <w:rPr>
             <w:rStyle w:val="Hyperlink"/>
           </w:rPr>
-          <w:t xml:space="preserve">Fax Machine and MFD Usage Policy</w:t>
+          <w:t xml:space="preserve">MFD Usage Policy</w:t>
         </w:r>
       </w:hyperlink>
       <w:r>

</xml_diff>